<commit_message>
fix: add restart policy to api/extractor containers + update DOCX template v14
- docker-compose: restart: unless-stopped on sop-api and sop-extractor to prevent
  502 errors during container crashes or rebuild downtime (root cause of WF0 probe-video 502)
- DOCX template v14: restructured TOC/sections to match Aged Debtor Process reference,
  removed orange bar under TOC, added SOP Author/Reviewer/Approver Certification section
- CHANGELOG: documented WF0 probe-video fix, DOCX restructure, and callout badge improvements

Co-Authored-By: Claude Sonnet 4.6 <noreply@anthropic.com>
</commit_message>
<xml_diff>
--- a/sop-platform/data/templates/sop_template.docx
+++ b/sop-platform/data/templates/sop_template.docx
@@ -4,255 +4,12 @@
   <w:body>
     <w:p>
       <w:pPr>
-        <w:shd w:val="clear" w:color="auto" w:fill="E85C1A"/>
         <w:spacing w:before="0" w:after="0"/>
       </w:pPr>
       <w:r>
-        <w:rPr>
-          <w:rFonts w:ascii="Calibri" w:hAnsi="Calibri"/>
-          <w:b/>
-          <w:i w:val="0"/>
-          <w:color w:val="FFFFFF"/>
-          <w:sz w:val="26"/>
-        </w:rPr>
-        <w:t xml:space="preserve">  STANDARD OPERATING PROCEDURE</w:t>
+        <w:t>{{ cover_page }}</w:t>
       </w:r>
     </w:p>
-    <w:p>
-      <w:pPr>
-        <w:spacing w:before="480" w:after="120"/>
-      </w:pPr>
-      <w:r>
-        <w:rPr>
-          <w:rFonts w:ascii="Calibri" w:hAnsi="Calibri"/>
-          <w:b/>
-          <w:i w:val="0"/>
-          <w:color w:val="1A1A2E"/>
-          <w:sz w:val="44"/>
-        </w:rPr>
-        <w:t>{{ sop_title }}</w:t>
-      </w:r>
-    </w:p>
-    <w:p>
-      <w:pPr>
-        <w:spacing w:before="0" w:after="360"/>
-      </w:pPr>
-      <w:r>
-        <w:rPr>
-          <w:rFonts w:ascii="Calibri" w:hAnsi="Calibri"/>
-          <w:b w:val="0"/>
-          <w:i/>
-          <w:color w:val="E85C1A"/>
-          <w:sz w:val="26"/>
-        </w:rPr>
-        <w:t>{{ process_name }}</w:t>
-      </w:r>
-    </w:p>
-    <w:tbl>
-      <w:tblPr>
-        <w:tblStyle w:val="TableGrid"/>
-        <w:tblW w:type="auto" w:w="0"/>
-        <w:tblLook w:firstColumn="1" w:firstRow="1" w:lastColumn="0" w:lastRow="0" w:noHBand="0" w:noVBand="1" w:val="04A0"/>
-        <w:jc w:val="left"/>
-        <w:tblBorders>
-          <w:top w:val="single" w:sz="4" w:space="0" w:color="D1D5DB"/>
-          <w:left w:val="single" w:sz="4" w:space="0" w:color="D1D5DB"/>
-          <w:bottom w:val="single" w:sz="4" w:space="0" w:color="D1D5DB"/>
-          <w:right w:val="single" w:sz="4" w:space="0" w:color="D1D5DB"/>
-          <w:insideH w:val="single" w:sz="4" w:space="0" w:color="D1D5DB"/>
-          <w:insideV w:val="single" w:sz="4" w:space="0" w:color="D1D5DB"/>
-        </w:tblBorders>
-      </w:tblPr>
-      <w:tblGrid>
-        <w:gridCol w:w="4535"/>
-        <w:gridCol w:w="4535"/>
-      </w:tblGrid>
-      <w:tr>
-        <w:tc>
-          <w:tcPr>
-            <w:tcW w:type="dxa" w:w="2592"/>
-            <w:shd w:val="clear" w:color="auto" w:fill="F3F4F6"/>
-          </w:tcPr>
-          <w:p>
-            <w:r>
-              <w:rPr>
-                <w:rFonts w:ascii="Calibri" w:hAnsi="Calibri"/>
-                <w:b/>
-                <w:i w:val="0"/>
-                <w:color w:val="1A1A2E"/>
-                <w:sz w:val="20"/>
-              </w:rPr>
-              <w:t>Client</w:t>
-            </w:r>
-          </w:p>
-        </w:tc>
-        <w:tc>
-          <w:tcPr>
-            <w:tcW w:type="dxa" w:w="5040"/>
-          </w:tcPr>
-          <w:p>
-            <w:r>
-              <w:rPr>
-                <w:rFonts w:ascii="Calibri" w:hAnsi="Calibri"/>
-                <w:b w:val="0"/>
-                <w:i w:val="0"/>
-                <w:color w:val="1A1A2E"/>
-                <w:sz w:val="20"/>
-              </w:rPr>
-              <w:t>{{ client_name }}</w:t>
-            </w:r>
-          </w:p>
-        </w:tc>
-      </w:tr>
-      <w:tr>
-        <w:tc>
-          <w:tcPr>
-            <w:tcW w:type="dxa" w:w="2592"/>
-            <w:shd w:val="clear" w:color="auto" w:fill="F3F4F6"/>
-          </w:tcPr>
-          <w:p>
-            <w:r>
-              <w:rPr>
-                <w:rFonts w:ascii="Calibri" w:hAnsi="Calibri"/>
-                <w:b/>
-                <w:i w:val="0"/>
-                <w:color w:val="1A1A2E"/>
-                <w:sz w:val="20"/>
-              </w:rPr>
-              <w:t>Process</w:t>
-            </w:r>
-          </w:p>
-        </w:tc>
-        <w:tc>
-          <w:tcPr>
-            <w:tcW w:type="dxa" w:w="5040"/>
-          </w:tcPr>
-          <w:p>
-            <w:r>
-              <w:rPr>
-                <w:rFonts w:ascii="Calibri" w:hAnsi="Calibri"/>
-                <w:b w:val="0"/>
-                <w:i w:val="0"/>
-                <w:color w:val="1A1A2E"/>
-                <w:sz w:val="20"/>
-              </w:rPr>
-              <w:t>{{ process_name }}</w:t>
-            </w:r>
-          </w:p>
-        </w:tc>
-      </w:tr>
-      <w:tr>
-        <w:tc>
-          <w:tcPr>
-            <w:tcW w:type="dxa" w:w="2592"/>
-            <w:shd w:val="clear" w:color="auto" w:fill="F3F4F6"/>
-          </w:tcPr>
-          <w:p>
-            <w:r>
-              <w:rPr>
-                <w:rFonts w:ascii="Calibri" w:hAnsi="Calibri"/>
-                <w:b/>
-                <w:i w:val="0"/>
-                <w:color w:val="1A1A2E"/>
-                <w:sz w:val="20"/>
-              </w:rPr>
-              <w:t>Meeting Date</w:t>
-            </w:r>
-          </w:p>
-        </w:tc>
-        <w:tc>
-          <w:tcPr>
-            <w:tcW w:type="dxa" w:w="5040"/>
-          </w:tcPr>
-          <w:p>
-            <w:r>
-              <w:rPr>
-                <w:rFonts w:ascii="Calibri" w:hAnsi="Calibri"/>
-                <w:b w:val="0"/>
-                <w:i w:val="0"/>
-                <w:color w:val="1A1A2E"/>
-                <w:sz w:val="20"/>
-              </w:rPr>
-              <w:t>{{ meeting_date }}</w:t>
-            </w:r>
-          </w:p>
-        </w:tc>
-      </w:tr>
-      <w:tr>
-        <w:tc>
-          <w:tcPr>
-            <w:tcW w:type="dxa" w:w="2592"/>
-            <w:shd w:val="clear" w:color="auto" w:fill="F3F4F6"/>
-          </w:tcPr>
-          <w:p>
-            <w:r>
-              <w:rPr>
-                <w:rFonts w:ascii="Calibri" w:hAnsi="Calibri"/>
-                <w:b/>
-                <w:i w:val="0"/>
-                <w:color w:val="1A1A2E"/>
-                <w:sz w:val="20"/>
-              </w:rPr>
-              <w:t>Generated</w:t>
-            </w:r>
-          </w:p>
-        </w:tc>
-        <w:tc>
-          <w:tcPr>
-            <w:tcW w:type="dxa" w:w="5040"/>
-          </w:tcPr>
-          <w:p>
-            <w:r>
-              <w:rPr>
-                <w:rFonts w:ascii="Calibri" w:hAnsi="Calibri"/>
-                <w:b w:val="0"/>
-                <w:i w:val="0"/>
-                <w:color w:val="1A1A2E"/>
-                <w:sz w:val="20"/>
-              </w:rPr>
-              <w:t>{{ generated_date }}</w:t>
-            </w:r>
-          </w:p>
-        </w:tc>
-      </w:tr>
-      <w:tr>
-        <w:tc>
-          <w:tcPr>
-            <w:tcW w:type="dxa" w:w="2592"/>
-            <w:shd w:val="clear" w:color="auto" w:fill="F3F4F6"/>
-          </w:tcPr>
-          <w:p>
-            <w:r>
-              <w:rPr>
-                <w:rFonts w:ascii="Calibri" w:hAnsi="Calibri"/>
-                <w:b/>
-                <w:i w:val="0"/>
-                <w:color w:val="1A1A2E"/>
-                <w:sz w:val="20"/>
-              </w:rPr>
-              <w:t>Total Steps</w:t>
-            </w:r>
-          </w:p>
-        </w:tc>
-        <w:tc>
-          <w:tcPr>
-            <w:tcW w:type="dxa" w:w="5040"/>
-          </w:tcPr>
-          <w:p>
-            <w:r>
-              <w:rPr>
-                <w:rFonts w:ascii="Calibri" w:hAnsi="Calibri"/>
-                <w:b w:val="0"/>
-                <w:i w:val="0"/>
-                <w:color w:val="1A1A2E"/>
-                <w:sz w:val="20"/>
-              </w:rPr>
-              <w:t>{{ step_count }}</w:t>
-            </w:r>
-          </w:p>
-        </w:tc>
-      </w:tr>
-    </w:tbl>
     <w:p>
       <w:r>
         <w:br w:type="page"/>
@@ -272,21 +29,6 @@
           <w:sz w:val="32"/>
         </w:rPr>
         <w:t>Table of Contents</w:t>
-      </w:r>
-    </w:p>
-    <w:p>
-      <w:pPr>
-        <w:shd w:val="clear" w:color="auto" w:fill="E85C1A"/>
-        <w:spacing w:before="0" w:after="160"/>
-      </w:pPr>
-      <w:r>
-        <w:rPr>
-          <w:rFonts w:ascii="Calibri" w:hAnsi="Calibri"/>
-          <w:b w:val="0"/>
-          <w:i w:val="0"/>
-          <w:sz w:val="8"/>
-        </w:rPr>
-        <w:t xml:space="preserve"> </w:t>
       </w:r>
     </w:p>
     <w:p>
@@ -412,16 +154,8 @@
     </w:p>
     <w:p>
       <w:pPr>
-        <w:spacing w:after="0" w:before="0"/>
-      </w:pPr>
-      <w:r>
-        <w:t>{%- for section in sections_pre %}</w:t>
-      </w:r>
-    </w:p>
-    <w:p>
-      <w:pPr>
-        <w:pStyle w:val="Heading2"/>
-        <w:spacing w:before="360" w:after="120"/>
+        <w:pStyle w:val="Heading1"/>
+        <w:spacing w:before="240" w:after="160"/>
       </w:pPr>
       <w:r>
         <w:rPr>
@@ -429,7 +163,69 @@
           <w:b/>
           <w:i w:val="0"/>
           <w:color w:val="E85C1A"/>
-          <w:sz w:val="26"/>
+          <w:sz w:val="30"/>
+        </w:rPr>
+        <w:t>1  Procedure Description</w:t>
+      </w:r>
+    </w:p>
+    <w:p>
+      <w:pPr>
+        <w:spacing w:after="0" w:before="0"/>
+      </w:pPr>
+      <w:r>
+        <w:t>{%- for section in procedure_sub_sections %}</w:t>
+      </w:r>
+    </w:p>
+    <w:p>
+      <w:pPr>
+        <w:pStyle w:val="Heading2"/>
+        <w:spacing w:before="200" w:after="80"/>
+      </w:pPr>
+      <w:r>
+        <w:rPr>
+          <w:rFonts w:ascii="Calibri" w:hAnsi="Calibri"/>
+          <w:b/>
+          <w:i w:val="0"/>
+          <w:color w:val="1A1A2E"/>
+          <w:sz w:val="24"/>
+        </w:rPr>
+        <w:t>{{ section.section_title }}</w:t>
+      </w:r>
+    </w:p>
+    <w:p>
+      <w:pPr/>
+      <w:r>
+        <w:t>{{r section.content_text }}</w:t>
+      </w:r>
+    </w:p>
+    <w:p>
+      <w:pPr>
+        <w:spacing w:after="0" w:before="0"/>
+      </w:pPr>
+      <w:r>
+        <w:t>{%- endfor %}</w:t>
+      </w:r>
+    </w:p>
+    <w:p>
+      <w:pPr>
+        <w:spacing w:after="0" w:before="0"/>
+      </w:pPr>
+      <w:r>
+        <w:t>{%- for section in other_pre_sections %}</w:t>
+      </w:r>
+    </w:p>
+    <w:p>
+      <w:pPr>
+        <w:pStyle w:val="Heading1"/>
+        <w:spacing w:before="240" w:after="160"/>
+      </w:pPr>
+      <w:r>
+        <w:rPr>
+          <w:rFonts w:ascii="Calibri" w:hAnsi="Calibri"/>
+          <w:b/>
+          <w:i w:val="0"/>
+          <w:color w:val="E85C1A"/>
+          <w:sz w:val="30"/>
         </w:rPr>
         <w:t>{{ section.num }}  {{ section.section_title }}</w:t>
       </w:r>
@@ -555,10 +351,42 @@
     </w:p>
     <w:p>
       <w:pPr>
-        <w:spacing w:before="80" w:after="80"/>
+        <w:spacing w:after="0" w:before="0"/>
       </w:pPr>
       <w:r>
-        <w:t>{%- if step.screenshot %}{{ step.screenshot }}{%- endif %}</w:t>
+        <w:t>{%- if step.screenshot %}</w:t>
+      </w:r>
+    </w:p>
+    <w:p>
+      <w:pPr>
+        <w:spacing w:before="120" w:after="40"/>
+      </w:pPr>
+      <w:r>
+        <w:t>{{ step.screenshot }}</w:t>
+      </w:r>
+    </w:p>
+    <w:p>
+      <w:pPr>
+        <w:jc w:val="center"/>
+        <w:spacing w:before="0" w:after="200"/>
+      </w:pPr>
+      <w:r>
+        <w:rPr>
+          <w:rFonts w:ascii="Calibri" w:hAnsi="Calibri"/>
+          <w:b/>
+          <w:i w:val="0"/>
+          <w:color w:val="1A1A2E"/>
+          <w:sz w:val="22"/>
+        </w:rPr>
+        <w:t>Screenshot {{ step.sequence }}</w:t>
+      </w:r>
+    </w:p>
+    <w:p>
+      <w:pPr>
+        <w:spacing w:after="0" w:before="0"/>
+      </w:pPr>
+      <w:r>
+        <w:t>{%- endif %}</w:t>
       </w:r>
     </w:p>
     <w:p>
@@ -683,14 +511,431 @@
         <w:t>{%- endfor %}</w:t>
       </w:r>
     </w:p>
+    <w:p>
+      <w:pPr>
+        <w:pStyle w:val="Heading1"/>
+        <w:spacing w:before="360" w:after="160"/>
+      </w:pPr>
+      <w:r>
+        <w:rPr>
+          <w:rFonts w:ascii="Calibri" w:hAnsi="Calibri"/>
+          <w:b/>
+          <w:i w:val="0"/>
+          <w:color w:val="E85C1A"/>
+          <w:sz w:val="30"/>
+        </w:rPr>
+        <w:t>{{ cert_section_num }}  SOP Author/Reviewer/Approver Certification</w:t>
+      </w:r>
+    </w:p>
+    <w:tbl>
+      <w:tblPr>
+        <w:tblW w:type="auto" w:w="0"/>
+        <w:tblLook w:firstColumn="1" w:firstRow="1" w:lastColumn="0" w:lastRow="0" w:noHBand="0" w:noVBand="1" w:val="04A0"/>
+        <w:jc w:val="left"/>
+        <w:tblBorders>
+          <w:top w:val="single" w:sz="4" w:space="0" w:color="D1D5DB"/>
+          <w:left w:val="single" w:sz="4" w:space="0" w:color="D1D5DB"/>
+          <w:bottom w:val="single" w:sz="4" w:space="0" w:color="D1D5DB"/>
+          <w:right w:val="single" w:sz="4" w:space="0" w:color="D1D5DB"/>
+          <w:insideH w:val="single" w:sz="4" w:space="0" w:color="D1D5DB"/>
+          <w:insideV w:val="single" w:sz="4" w:space="0" w:color="D1D5DB"/>
+        </w:tblBorders>
+      </w:tblPr>
+      <w:tblGrid>
+        <w:gridCol w:w="3024"/>
+        <w:gridCol w:w="3024"/>
+        <w:gridCol w:w="3024"/>
+      </w:tblGrid>
+      <w:tr>
+        <w:tc>
+          <w:tcPr>
+            <w:tcW w:type="dxa" w:w="3024"/>
+            <w:shd w:val="clear" w:color="auto" w:fill="E85C1A"/>
+          </w:tcPr>
+          <w:p>
+            <w:r>
+              <w:rPr>
+                <w:rFonts w:ascii="Calibri" w:hAnsi="Calibri"/>
+                <w:b/>
+                <w:i w:val="0"/>
+                <w:color w:val="FFFFFF"/>
+                <w:sz w:val="20"/>
+              </w:rPr>
+              <w:t>Role</w:t>
+            </w:r>
+          </w:p>
+        </w:tc>
+        <w:tc>
+          <w:tcPr>
+            <w:tcW w:type="dxa" w:w="3024"/>
+            <w:shd w:val="clear" w:color="auto" w:fill="E85C1A"/>
+          </w:tcPr>
+          <w:p>
+            <w:r>
+              <w:rPr>
+                <w:rFonts w:ascii="Calibri" w:hAnsi="Calibri"/>
+                <w:b/>
+                <w:i w:val="0"/>
+                <w:color w:val="FFFFFF"/>
+                <w:sz w:val="20"/>
+              </w:rPr>
+              <w:t>Name</w:t>
+            </w:r>
+          </w:p>
+        </w:tc>
+        <w:tc>
+          <w:tcPr>
+            <w:tcW w:type="dxa" w:w="3024"/>
+            <w:shd w:val="clear" w:color="auto" w:fill="E85C1A"/>
+          </w:tcPr>
+          <w:p>
+            <w:r>
+              <w:rPr>
+                <w:rFonts w:ascii="Calibri" w:hAnsi="Calibri"/>
+                <w:b/>
+                <w:i w:val="0"/>
+                <w:color w:val="FFFFFF"/>
+                <w:sz w:val="20"/>
+              </w:rPr>
+              <w:t>Signature &amp; Date</w:t>
+            </w:r>
+          </w:p>
+        </w:tc>
+      </w:tr>
+      <w:tr>
+        <w:tc>
+          <w:tcPr>
+            <w:tcW w:type="dxa" w:w="3024"/>
+            <w:shd w:val="clear" w:color="auto" w:fill="F8F9FA"/>
+          </w:tcPr>
+          <w:p>
+            <w:r>
+              <w:rPr>
+                <w:rFonts w:ascii="Calibri" w:hAnsi="Calibri"/>
+                <w:b w:val="0"/>
+                <w:i w:val="0"/>
+                <w:sz w:val="20"/>
+              </w:rPr>
+              <w:t>Author / SOP Writer</w:t>
+            </w:r>
+          </w:p>
+        </w:tc>
+        <w:tc>
+          <w:tcPr>
+            <w:tcW w:type="dxa" w:w="3024"/>
+            <w:shd w:val="clear" w:color="auto" w:fill="F8F9FA"/>
+          </w:tcPr>
+          <w:p>
+            <w:r>
+              <w:rPr>
+                <w:rFonts w:ascii="Calibri" w:hAnsi="Calibri"/>
+                <w:b w:val="0"/>
+                <w:i w:val="0"/>
+                <w:sz w:val="20"/>
+              </w:rPr>
+            </w:r>
+          </w:p>
+        </w:tc>
+        <w:tc>
+          <w:tcPr>
+            <w:tcW w:type="dxa" w:w="3024"/>
+            <w:shd w:val="clear" w:color="auto" w:fill="F8F9FA"/>
+          </w:tcPr>
+          <w:p>
+            <w:r>
+              <w:rPr>
+                <w:rFonts w:ascii="Calibri" w:hAnsi="Calibri"/>
+                <w:b w:val="0"/>
+                <w:i w:val="0"/>
+                <w:sz w:val="20"/>
+              </w:rPr>
+            </w:r>
+          </w:p>
+        </w:tc>
+      </w:tr>
+      <w:tr>
+        <w:tc>
+          <w:tcPr>
+            <w:tcW w:type="dxa" w:w="3024"/>
+            <w:shd w:val="clear" w:color="auto" w:fill="FFFFFF"/>
+          </w:tcPr>
+          <w:p>
+            <w:r>
+              <w:rPr>
+                <w:rFonts w:ascii="Calibri" w:hAnsi="Calibri"/>
+                <w:b w:val="0"/>
+                <w:i w:val="0"/>
+                <w:sz w:val="20"/>
+              </w:rPr>
+              <w:t>Reviewer</w:t>
+            </w:r>
+          </w:p>
+        </w:tc>
+        <w:tc>
+          <w:tcPr>
+            <w:tcW w:type="dxa" w:w="3024"/>
+            <w:shd w:val="clear" w:color="auto" w:fill="FFFFFF"/>
+          </w:tcPr>
+          <w:p>
+            <w:r>
+              <w:rPr>
+                <w:rFonts w:ascii="Calibri" w:hAnsi="Calibri"/>
+                <w:b w:val="0"/>
+                <w:i w:val="0"/>
+                <w:sz w:val="20"/>
+              </w:rPr>
+            </w:r>
+          </w:p>
+        </w:tc>
+        <w:tc>
+          <w:tcPr>
+            <w:tcW w:type="dxa" w:w="3024"/>
+            <w:shd w:val="clear" w:color="auto" w:fill="FFFFFF"/>
+          </w:tcPr>
+          <w:p>
+            <w:r>
+              <w:rPr>
+                <w:rFonts w:ascii="Calibri" w:hAnsi="Calibri"/>
+                <w:b w:val="0"/>
+                <w:i w:val="0"/>
+                <w:sz w:val="20"/>
+              </w:rPr>
+            </w:r>
+          </w:p>
+        </w:tc>
+      </w:tr>
+      <w:tr>
+        <w:tc>
+          <w:tcPr>
+            <w:tcW w:type="dxa" w:w="3024"/>
+            <w:shd w:val="clear" w:color="auto" w:fill="F8F9FA"/>
+          </w:tcPr>
+          <w:p>
+            <w:r>
+              <w:rPr>
+                <w:rFonts w:ascii="Calibri" w:hAnsi="Calibri"/>
+                <w:b w:val="0"/>
+                <w:i w:val="0"/>
+                <w:sz w:val="20"/>
+              </w:rPr>
+              <w:t>Approver</w:t>
+            </w:r>
+          </w:p>
+        </w:tc>
+        <w:tc>
+          <w:tcPr>
+            <w:tcW w:type="dxa" w:w="3024"/>
+            <w:shd w:val="clear" w:color="auto" w:fill="F8F9FA"/>
+          </w:tcPr>
+          <w:p>
+            <w:r>
+              <w:rPr>
+                <w:rFonts w:ascii="Calibri" w:hAnsi="Calibri"/>
+                <w:b w:val="0"/>
+                <w:i w:val="0"/>
+                <w:sz w:val="20"/>
+              </w:rPr>
+            </w:r>
+          </w:p>
+        </w:tc>
+        <w:tc>
+          <w:tcPr>
+            <w:tcW w:type="dxa" w:w="3024"/>
+            <w:shd w:val="clear" w:color="auto" w:fill="F8F9FA"/>
+          </w:tcPr>
+          <w:p>
+            <w:r>
+              <w:rPr>
+                <w:rFonts w:ascii="Calibri" w:hAnsi="Calibri"/>
+                <w:b w:val="0"/>
+                <w:i w:val="0"/>
+                <w:sz w:val="20"/>
+              </w:rPr>
+            </w:r>
+          </w:p>
+        </w:tc>
+      </w:tr>
+    </w:tbl>
     <w:sectPr>
+      <w:headerReference w:type="default" r:id="rId9"/>
+      <w:footerReference w:type="default" r:id="rId10"/>
       <w:pgSz w:w="11906" w:h="16838"/>
       <w:pgMar w:top="1417" w:right="1134" w:bottom="1417" w:left="1701" w:header="720" w:footer="720" w:gutter="0"/>
       <w:cols w:space="720"/>
+      <w:titlePg/>
       <w:docGrid w:linePitch="360"/>
     </w:sectPr>
   </w:body>
 </w:document>
+</file>
+
+<file path=word/footer1.xml><?xml version="1.0" encoding="utf-8"?>
+<w:ftr xmlns:m="http://schemas.openxmlformats.org/officeDocument/2006/math" xmlns:mc="http://schemas.openxmlformats.org/markup-compatibility/2006" xmlns:mo="http://schemas.microsoft.com/office/mac/office/2008/main" xmlns:mv="urn:schemas-microsoft-com:mac:vml" xmlns:o="urn:schemas-microsoft-com:office:office" xmlns:r="http://schemas.openxmlformats.org/officeDocument/2006/relationships" xmlns:v="urn:schemas-microsoft-com:vml" xmlns:w10="urn:schemas-microsoft-com:office:word" xmlns:w14="http://schemas.microsoft.com/office/word/2010/wordml" xmlns:w="http://schemas.openxmlformats.org/wordprocessingml/2006/main" xmlns:wne="http://schemas.microsoft.com/office/word/2006/wordml" xmlns:wp14="http://schemas.microsoft.com/office/word/2010/wordprocessingDrawing" xmlns:wp="http://schemas.openxmlformats.org/drawingml/2006/wordprocessingDrawing" xmlns:wpc="http://schemas.microsoft.com/office/word/2010/wordprocessingCanvas" xmlns:wpg="http://schemas.microsoft.com/office/word/2010/wordprocessingGroup" xmlns:wpi="http://schemas.microsoft.com/office/word/2010/wordprocessingInk" xmlns:wps="http://schemas.microsoft.com/office/word/2010/wordprocessingShape" mc:Ignorable="w14 wp14">
+  <w:p>
+    <w:pPr>
+      <w:pStyle w:val="Footer"/>
+      <w:spacing w:before="40" w:after="0"/>
+      <w:tabs>
+        <w:tab w:val="right" w:pos="9072"/>
+      </w:tabs>
+    </w:pPr>
+    <w:r>
+      <w:rPr>
+        <w:rFonts w:ascii="Calibri" w:hAnsi="Calibri"/>
+        <w:b w:val="0"/>
+        <w:i w:val="0"/>
+        <w:color w:val="0000CC"/>
+        <w:sz w:val="16"/>
+      </w:rPr>
+      <w:t>https://www.infomateworld.com/</w:t>
+    </w:r>
+    <w:r>
+      <w:rPr>
+        <w:rFonts w:ascii="Calibri" w:hAnsi="Calibri"/>
+        <w:b w:val="0"/>
+        <w:i w:val="0"/>
+        <w:sz w:val="16"/>
+      </w:rPr>
+      <w:tab/>
+    </w:r>
+    <w:r>
+      <w:rPr>
+        <w:rFonts w:ascii="Calibri" w:hAnsi="Calibri"/>
+        <w:b w:val="0"/>
+        <w:i w:val="0"/>
+        <w:color w:val="1A1A2E"/>
+        <w:sz w:val="16"/>
+      </w:rPr>
+      <w:fldChar w:fldCharType="begin"/>
+      <w:instrText xml:space="preserve"> PAGE </w:instrText>
+      <w:fldChar w:fldCharType="end"/>
+    </w:r>
+  </w:p>
+  <w:p>
+    <w:pPr>
+      <w:spacing w:before="0" w:after="0"/>
+      <w:tabs>
+        <w:tab w:val="right" w:pos="9072"/>
+      </w:tabs>
+    </w:pPr>
+    <w:r>
+      <w:rPr>
+        <w:rFonts w:ascii="Calibri" w:hAnsi="Calibri"/>
+        <w:b w:val="0"/>
+        <w:i w:val="0"/>
+        <w:color w:val="1A1A2E"/>
+        <w:sz w:val="16"/>
+      </w:rPr>
+      <w:t>No 04, Leyden Bastian Street, Colombo 01, Sri Lanka</w:t>
+    </w:r>
+    <w:r>
+      <w:rPr>
+        <w:rFonts w:ascii="Calibri" w:hAnsi="Calibri"/>
+        <w:b w:val="0"/>
+        <w:i w:val="0"/>
+        <w:sz w:val="16"/>
+      </w:rPr>
+      <w:tab/>
+    </w:r>
+    <w:r>
+      <w:drawing>
+        <wp:inline xmlns:a="http://schemas.openxmlformats.org/drawingml/2006/main" xmlns:pic="http://schemas.openxmlformats.org/drawingml/2006/picture">
+          <wp:extent cx="678942" cy="201168"/>
+          <wp:docPr id="1" name="Picture 1"/>
+          <wp:cNvGraphicFramePr>
+            <a:graphicFrameLocks noChangeAspect="1"/>
+          </wp:cNvGraphicFramePr>
+          <a:graphic>
+            <a:graphicData uri="http://schemas.openxmlformats.org/drawingml/2006/picture">
+              <pic:pic>
+                <pic:nvPicPr>
+                  <pic:cNvPr id="0" name="footer.jpg"/>
+                  <pic:cNvPicPr/>
+                </pic:nvPicPr>
+                <pic:blipFill>
+                  <a:blip r:embed="rId1"/>
+                  <a:stretch>
+                    <a:fillRect/>
+                  </a:stretch>
+                </pic:blipFill>
+                <pic:spPr>
+                  <a:xfrm>
+                    <a:off x="0" y="0"/>
+                    <a:ext cx="678942" cy="201168"/>
+                  </a:xfrm>
+                  <a:prstGeom prst="rect"/>
+                </pic:spPr>
+              </pic:pic>
+            </a:graphicData>
+          </a:graphic>
+        </wp:inline>
+      </w:drawing>
+    </w:r>
+  </w:p>
+</w:ftr>
+</file>
+
+<file path=word/header1.xml><?xml version="1.0" encoding="utf-8"?>
+<w:hdr xmlns:m="http://schemas.openxmlformats.org/officeDocument/2006/math" xmlns:mc="http://schemas.openxmlformats.org/markup-compatibility/2006" xmlns:mo="http://schemas.microsoft.com/office/mac/office/2008/main" xmlns:mv="urn:schemas-microsoft-com:mac:vml" xmlns:o="urn:schemas-microsoft-com:office:office" xmlns:r="http://schemas.openxmlformats.org/officeDocument/2006/relationships" xmlns:v="urn:schemas-microsoft-com:vml" xmlns:w10="urn:schemas-microsoft-com:office:word" xmlns:w14="http://schemas.microsoft.com/office/word/2010/wordml" xmlns:w="http://schemas.openxmlformats.org/wordprocessingml/2006/main" xmlns:wne="http://schemas.microsoft.com/office/word/2006/wordml" xmlns:wp14="http://schemas.microsoft.com/office/word/2010/wordprocessingDrawing" xmlns:wp="http://schemas.openxmlformats.org/drawingml/2006/wordprocessingDrawing" xmlns:wpc="http://schemas.microsoft.com/office/word/2010/wordprocessingCanvas" xmlns:wpg="http://schemas.microsoft.com/office/word/2010/wordprocessingGroup" xmlns:wpi="http://schemas.microsoft.com/office/word/2010/wordprocessingInk" xmlns:wps="http://schemas.microsoft.com/office/word/2010/wordprocessingShape" mc:Ignorable="w14 wp14">
+  <w:p>
+    <w:pPr>
+      <w:pStyle w:val="Header"/>
+      <w:spacing w:before="0" w:after="0"/>
+      <w:jc w:val="right"/>
+    </w:pPr>
+    <w:r>
+      <w:drawing>
+        <wp:inline xmlns:a="http://schemas.openxmlformats.org/drawingml/2006/main" xmlns:pic="http://schemas.openxmlformats.org/drawingml/2006/picture">
+          <wp:extent cx="442341" cy="411480"/>
+          <wp:docPr id="1" name="Picture 1"/>
+          <wp:cNvGraphicFramePr>
+            <a:graphicFrameLocks noChangeAspect="1"/>
+          </wp:cNvGraphicFramePr>
+          <a:graphic>
+            <a:graphicData uri="http://schemas.openxmlformats.org/drawingml/2006/picture">
+              <pic:pic>
+                <pic:nvPicPr>
+                  <pic:cNvPr id="0" name="header.jpg"/>
+                  <pic:cNvPicPr/>
+                </pic:nvPicPr>
+                <pic:blipFill>
+                  <a:blip r:embed="rId1"/>
+                  <a:stretch>
+                    <a:fillRect/>
+                  </a:stretch>
+                </pic:blipFill>
+                <pic:spPr>
+                  <a:xfrm>
+                    <a:off x="0" y="0"/>
+                    <a:ext cx="442341" cy="411480"/>
+                  </a:xfrm>
+                  <a:prstGeom prst="rect"/>
+                </pic:spPr>
+              </pic:pic>
+            </a:graphicData>
+          </a:graphic>
+        </wp:inline>
+      </w:drawing>
+    </w:r>
+  </w:p>
+  <w:p>
+    <w:pPr>
+      <w:spacing w:before="0" w:after="0"/>
+      <w:pBdr>
+        <w:bottom w:val="single" w:sz="6" w:space="1" w:color="AAAAAA"/>
+      </w:pBdr>
+    </w:pPr>
+    <w:r>
+      <w:rPr>
+        <w:rFonts w:ascii="Calibri" w:hAnsi="Calibri"/>
+        <w:b w:val="0"/>
+        <w:i w:val="0"/>
+        <w:sz w:val="2"/>
+      </w:rPr>
+      <w:t xml:space="preserve"> </w:t>
+    </w:r>
+  </w:p>
+</w:hdr>
 </file>
 
 <file path=word/numbering.xml><?xml version="1.0" encoding="utf-8"?>

</xml_diff>

<commit_message>
fix(merge): make compare async to fix 503 timeout for large SOPs
POST /api/merge/compare now returns immediately with status='comparing'
and runs the Gemini diff in a background task (600s timeout). Frontend
polls GET /merge/sessions/{id} every 3s until status='reviewing', then
navigates to the diff review page. Fixes 503 on 60+ step merges caused
by the old synchronous 120s httpx timeout.

Co-Authored-By: Claude Sonnet 4.6 <noreply@anthropic.com>
</commit_message>
<xml_diff>
--- a/sop-platform/data/templates/sop_template.docx
+++ b/sop-platform/data/templates/sop_template.docx
@@ -11,9 +11,14 @@
       </w:r>
     </w:p>
     <w:p>
-      <w:r>
-        <w:br w:type="page"/>
-      </w:r>
+      <w:pPr>
+        <w:sectPr>
+          <w:pgSz w:w="11906" w:h="16838"/>
+          <w:pgMar w:top="0" w:right="0" w:bottom="0" w:left="0" w:header="720" w:footer="720" w:gutter="0"/>
+          <w:cols w:space="720"/>
+          <w:docGrid w:linePitch="360"/>
+        </w:sectPr>
+      </w:pPr>
     </w:p>
     <w:p>
       <w:pPr>
@@ -762,7 +767,6 @@
       <w:pgSz w:w="11906" w:h="16838"/>
       <w:pgMar w:top="1417" w:right="1134" w:bottom="1417" w:left="1701" w:header="720" w:footer="720" w:gutter="0"/>
       <w:cols w:space="720"/>
-      <w:titlePg/>
       <w:docGrid w:linePitch="360"/>
     </w:sectPr>
   </w:body>
@@ -774,6 +778,20 @@
   <w:p>
     <w:pPr>
       <w:pStyle w:val="Footer"/>
+      <w:spacing w:before="0" w:after="0"/>
+      <w:pBdr>
+        <w:top w:val="single" w:sz="6" w:space="1" w:color="AAAAAA"/>
+      </w:pBdr>
+    </w:pPr>
+    <w:r>
+      <w:rPr>
+        <w:sz w:val="2"/>
+      </w:rPr>
+      <w:t xml:space="preserve"> </w:t>
+    </w:r>
+  </w:p>
+  <w:p>
+    <w:pPr>
       <w:spacing w:before="40" w:after="0"/>
       <w:tabs>
         <w:tab w:val="right" w:pos="9072"/>
@@ -881,12 +899,13 @@
     <w:pPr>
       <w:pStyle w:val="Header"/>
       <w:spacing w:before="0" w:after="0"/>
+      <w:shd w:val="clear" w:color="auto" w:fill="auto"/>
       <w:jc w:val="right"/>
     </w:pPr>
     <w:r>
       <w:drawing>
         <wp:inline xmlns:a="http://schemas.openxmlformats.org/drawingml/2006/main" xmlns:pic="http://schemas.openxmlformats.org/drawingml/2006/picture">
-          <wp:extent cx="442341" cy="411480"/>
+          <wp:extent cx="728372" cy="720000"/>
           <wp:docPr id="1" name="Picture 1"/>
           <wp:cNvGraphicFramePr>
             <a:graphicFrameLocks noChangeAspect="1"/>
@@ -895,7 +914,7 @@
             <a:graphicData uri="http://schemas.openxmlformats.org/drawingml/2006/picture">
               <pic:pic>
                 <pic:nvPicPr>
-                  <pic:cNvPr id="0" name="header.jpg"/>
+                  <pic:cNvPr id="0" name="header1.jpg"/>
                   <pic:cNvPicPr/>
                 </pic:nvPicPr>
                 <pic:blipFill>
@@ -907,7 +926,7 @@
                 <pic:spPr>
                   <a:xfrm>
                     <a:off x="0" y="0"/>
-                    <a:ext cx="442341" cy="411480"/>
+                    <a:ext cx="728372" cy="720000"/>
                   </a:xfrm>
                   <a:prstGeom prst="rect"/>
                 </pic:spPr>
@@ -916,6 +935,15 @@
           </a:graphic>
         </wp:inline>
       </w:drawing>
+    </w:r>
+    <w:r>
+      <w:rPr>
+        <w:rFonts w:ascii="Calibri" w:hAnsi="Calibri"/>
+        <w:b w:val="0"/>
+        <w:i w:val="0"/>
+        <w:sz w:val="2"/>
+      </w:rPr>
+      <w:t xml:space="preserve"> </w:t>
     </w:r>
   </w:p>
   <w:p>

</xml_diff>

<commit_message>
feat: add pause/resume pipeline + error display on SOP card
- Add paused status to PipelineStatus enum (fixes Azure 500 crash)
- Add POST /api/sops/{id}/pause-pipeline and resume-pipeline endpoints
- Resume re-triggers correct workflow based on paused stage
- Expose pipeline_error in SOP list for failed pipeline display
- SOPCard: amber Pause button, paused state row with Resume, error banner
- SOPCard: warn + 'Stop & Delete' when deleting a processing SOP
- On SOP delete: mark active pipeline_run as failed before cascade delete
- schema/010_pause_pipeline.sql: ALTER TYPE adds paused enum value

Co-Authored-By: Claude Sonnet 4.6 <noreply@anthropic.com>
</commit_message>
<xml_diff>
--- a/sop-platform/data/templates/sop_template.docx
+++ b/sop-platform/data/templates/sop_template.docx
@@ -796,7 +796,7 @@
         <w:color w:val="0000CC"/>
         <w:sz w:val="16"/>
       </w:rPr>
-      <w:t>https://www.infomateworld.com/</w:t>
+      <w:t>https://cloudnavision.com/</w:t>
     </w:r>
     <w:r>
       <w:rPr>
@@ -835,7 +835,7 @@
         <w:color w:val="1A1A2E"/>
         <w:sz w:val="16"/>
       </w:rPr>
-      <w:t>No 04, Leyden Bastian Street, Colombo 01, Sri Lanka</w:t>
+      <w:t>CloudNavision Private Limited</w:t>
     </w:r>
     <w:r>
       <w:rPr>
@@ -847,9 +847,32 @@
       <w:tab/>
     </w:r>
     <w:r>
+      <w:rPr>
+        <w:rFonts w:ascii="Calibri" w:hAnsi="Calibri"/>
+        <w:b/>
+        <w:i w:val="0"/>
+        <w:color w:val="06B6D4"/>
+        <w:sz w:val="16"/>
+      </w:rPr>
+      <w:t>CloudNavision</w:t>
+    </w:r>
+  </w:p>
+</w:ftr>
+</file>
+
+<file path=word/header1.xml><?xml version="1.0" encoding="utf-8"?>
+<w:hdr xmlns:m="http://schemas.openxmlformats.org/officeDocument/2006/math" xmlns:mc="http://schemas.openxmlformats.org/markup-compatibility/2006" xmlns:mo="http://schemas.microsoft.com/office/mac/office/2008/main" xmlns:mv="urn:schemas-microsoft-com:mac:vml" xmlns:o="urn:schemas-microsoft-com:office:office" xmlns:r="http://schemas.openxmlformats.org/officeDocument/2006/relationships" xmlns:v="urn:schemas-microsoft-com:vml" xmlns:w10="urn:schemas-microsoft-com:office:word" xmlns:w14="http://schemas.microsoft.com/office/word/2010/wordml" xmlns:w="http://schemas.openxmlformats.org/wordprocessingml/2006/main" xmlns:wne="http://schemas.microsoft.com/office/word/2006/wordml" xmlns:wp14="http://schemas.microsoft.com/office/word/2010/wordprocessingDrawing" xmlns:wp="http://schemas.openxmlformats.org/drawingml/2006/wordprocessingDrawing" xmlns:wpc="http://schemas.microsoft.com/office/word/2010/wordprocessingCanvas" xmlns:wpg="http://schemas.microsoft.com/office/word/2010/wordprocessingGroup" xmlns:wpi="http://schemas.microsoft.com/office/word/2010/wordprocessingInk" xmlns:wps="http://schemas.microsoft.com/office/word/2010/wordprocessingShape" mc:Ignorable="w14 wp14">
+  <w:p>
+    <w:pPr>
+      <w:pStyle w:val="Header"/>
+      <w:spacing w:before="0" w:after="0"/>
+      <w:shd w:val="clear" w:color="auto" w:fill="auto"/>
+      <w:jc w:val="right"/>
+    </w:pPr>
+    <w:r>
       <w:drawing>
         <wp:inline xmlns:a="http://schemas.openxmlformats.org/drawingml/2006/main" xmlns:pic="http://schemas.openxmlformats.org/drawingml/2006/picture">
-          <wp:extent cx="678942" cy="201168"/>
+          <wp:extent cx="720000" cy="720000"/>
           <wp:docPr id="1" name="Picture 1"/>
           <wp:cNvGraphicFramePr>
             <a:graphicFrameLocks noChangeAspect="1"/>
@@ -858,7 +881,7 @@
             <a:graphicData uri="http://schemas.openxmlformats.org/drawingml/2006/picture">
               <pic:pic>
                 <pic:nvPicPr>
-                  <pic:cNvPr id="0" name="footer.jpg"/>
+                  <pic:cNvPr id="0" name="cloudnavision_logo.jpg"/>
                   <pic:cNvPicPr/>
                 </pic:nvPicPr>
                 <pic:blipFill>
@@ -870,54 +893,7 @@
                 <pic:spPr>
                   <a:xfrm>
                     <a:off x="0" y="0"/>
-                    <a:ext cx="678942" cy="201168"/>
-                  </a:xfrm>
-                  <a:prstGeom prst="rect"/>
-                </pic:spPr>
-              </pic:pic>
-            </a:graphicData>
-          </a:graphic>
-        </wp:inline>
-      </w:drawing>
-    </w:r>
-  </w:p>
-</w:ftr>
-</file>
-
-<file path=word/header1.xml><?xml version="1.0" encoding="utf-8"?>
-<w:hdr xmlns:m="http://schemas.openxmlformats.org/officeDocument/2006/math" xmlns:mc="http://schemas.openxmlformats.org/markup-compatibility/2006" xmlns:mo="http://schemas.microsoft.com/office/mac/office/2008/main" xmlns:mv="urn:schemas-microsoft-com:mac:vml" xmlns:o="urn:schemas-microsoft-com:office:office" xmlns:r="http://schemas.openxmlformats.org/officeDocument/2006/relationships" xmlns:v="urn:schemas-microsoft-com:vml" xmlns:w10="urn:schemas-microsoft-com:office:word" xmlns:w14="http://schemas.microsoft.com/office/word/2010/wordml" xmlns:w="http://schemas.openxmlformats.org/wordprocessingml/2006/main" xmlns:wne="http://schemas.microsoft.com/office/word/2006/wordml" xmlns:wp14="http://schemas.microsoft.com/office/word/2010/wordprocessingDrawing" xmlns:wp="http://schemas.openxmlformats.org/drawingml/2006/wordprocessingDrawing" xmlns:wpc="http://schemas.microsoft.com/office/word/2010/wordprocessingCanvas" xmlns:wpg="http://schemas.microsoft.com/office/word/2010/wordprocessingGroup" xmlns:wpi="http://schemas.microsoft.com/office/word/2010/wordprocessingInk" xmlns:wps="http://schemas.microsoft.com/office/word/2010/wordprocessingShape" mc:Ignorable="w14 wp14">
-  <w:p>
-    <w:pPr>
-      <w:pStyle w:val="Header"/>
-      <w:spacing w:before="0" w:after="0"/>
-      <w:shd w:val="clear" w:color="auto" w:fill="auto"/>
-      <w:jc w:val="right"/>
-    </w:pPr>
-    <w:r>
-      <w:drawing>
-        <wp:inline xmlns:a="http://schemas.openxmlformats.org/drawingml/2006/main" xmlns:pic="http://schemas.openxmlformats.org/drawingml/2006/picture">
-          <wp:extent cx="728372" cy="720000"/>
-          <wp:docPr id="1" name="Picture 1"/>
-          <wp:cNvGraphicFramePr>
-            <a:graphicFrameLocks noChangeAspect="1"/>
-          </wp:cNvGraphicFramePr>
-          <a:graphic>
-            <a:graphicData uri="http://schemas.openxmlformats.org/drawingml/2006/picture">
-              <pic:pic>
-                <pic:nvPicPr>
-                  <pic:cNvPr id="0" name="header1.jpg"/>
-                  <pic:cNvPicPr/>
-                </pic:nvPicPr>
-                <pic:blipFill>
-                  <a:blip r:embed="rId1"/>
-                  <a:stretch>
-                    <a:fillRect/>
-                  </a:stretch>
-                </pic:blipFill>
-                <pic:spPr>
-                  <a:xfrm>
-                    <a:off x="0" y="0"/>
-                    <a:ext cx="728372" cy="720000"/>
+                    <a:ext cx="720000" cy="720000"/>
                   </a:xfrm>
                   <a:prstGeom prst="rect"/>
                 </pic:spPr>
@@ -941,7 +917,7 @@
     <w:pPr>
       <w:spacing w:before="0" w:after="0"/>
       <w:pBdr>
-        <w:bottom w:val="single" w:sz="6" w:space="1" w:color="AAAAAA"/>
+        <w:bottom w:val="single" w:sz="6" w:space="1" w:color="06B6D4"/>
       </w:pBdr>
     </w:pPr>
     <w:r>

</xml_diff>